<commit_message>
updated with the new address
</commit_message>
<xml_diff>
--- a/backend-templates/MultiCombinations-fixed.docx
+++ b/backend-templates/MultiCombinations-fixed.docx
@@ -1545,14 +1545,14 @@
           <w:sz w:val="21"/>
           <w:szCs w:val="21"/>
         </w:rPr>
-        <w:t>CloudFuze, Inc.</w:t>
+        <w:t>CloudFuze, Inc. with a place of business at 600 Park Offices Dr, suite#LL-52 Durham, NC 27709 (“Company”), and the Customer listed above (“Customer”). This Agreement includes and incorporates the above Order Form, Included in Migration Exhibit ("Exhibit 1"), Not included in Migration Exhibit ("Exhibit 2"), all attachments hereto, as well as the attached Terms and Conditions and contains, among other things, warranty disclaimers, liability limitations and use limitations. There shall be no force or effect to any different terms of any related purchase order or similar form even if signed by the parties after the date hereof.</w:t>
       </w:r>
       <w:r>
         <w:rPr>
           <w:sz w:val="21"/>
           <w:szCs w:val="21"/>
         </w:rPr>
-        <w:t xml:space="preserve"> with a place of business at </w:t>
+        <w:t xml:space="preserve"/>
       </w:r>
       <w:r>
         <w:rPr>
@@ -1560,14 +1560,14 @@
           <w:szCs w:val="21"/>
           <w:u w:val="single" w:color="000000"/>
         </w:rPr>
-        <w:t>2500 Re</w:t>
+        <w:t/>
       </w:r>
       <w:r>
         <w:rPr>
           <w:sz w:val="21"/>
           <w:szCs w:val="21"/>
         </w:rPr>
-        <w:t>g</w:t>
+        <w:t/>
       </w:r>
       <w:r>
         <w:rPr>
@@ -1575,14 +1575,14 @@
           <w:szCs w:val="21"/>
           <w:u w:val="single" w:color="000000"/>
         </w:rPr>
-        <w:t>enc</w:t>
+        <w:t/>
       </w:r>
       <w:r>
         <w:rPr>
           <w:sz w:val="21"/>
           <w:szCs w:val="21"/>
         </w:rPr>
-        <w:t>y</w:t>
+        <w:t/>
       </w:r>
       <w:r>
         <w:rPr>
@@ -1590,14 +1590,14 @@
           <w:szCs w:val="21"/>
           <w:u w:val="single" w:color="000000"/>
         </w:rPr>
-        <w:t xml:space="preserve"> Parkway</w:t>
+        <w:t xml:space="preserve"/>
       </w:r>
       <w:r>
         <w:rPr>
           <w:sz w:val="21"/>
           <w:szCs w:val="21"/>
         </w:rPr>
-        <w:t>,</w:t>
+        <w:t/>
       </w:r>
       <w:r>
         <w:rPr>
@@ -1605,14 +1605,14 @@
           <w:szCs w:val="21"/>
           <w:u w:val="single" w:color="000000"/>
         </w:rPr>
-        <w:t xml:space="preserve"> Cary</w:t>
+        <w:t xml:space="preserve"/>
       </w:r>
       <w:r>
         <w:rPr>
           <w:sz w:val="21"/>
           <w:szCs w:val="21"/>
         </w:rPr>
-        <w:t>,</w:t>
+        <w:t/>
       </w:r>
       <w:r>
         <w:rPr>
@@ -1620,42 +1620,42 @@
           <w:szCs w:val="21"/>
           <w:u w:val="single" w:color="000000"/>
         </w:rPr>
-        <w:t xml:space="preserve"> NC 27518</w:t>
+        <w:t xml:space="preserve"/>
       </w:r>
       <w:r>
         <w:rPr>
           <w:sz w:val="21"/>
           <w:szCs w:val="21"/>
         </w:rPr>
-        <w:t xml:space="preserve"> (“Company”), and the Customer listed above (“Customer”). This Agreement includes and incorporates the above Order Form, Included in Migration Exhibit ("Exhibit 1"), Not included in Migration Exhibit ("Exhibit 2"), all attachments hereto, as well as the attached Terms and Conditions and contains, among other things, warranty disclaimers, liability limitations and use limitations. There shall be no force or effect to any different terms of any related purchase order or similar form even if signed by the</w:t>
+        <w:t xml:space="preserve"/>
       </w:r>
       <w:r>
         <w:rPr>
           <w:sz w:val="21"/>
           <w:szCs w:val="21"/>
         </w:rPr>
-        <w:t xml:space="preserve"> </w:t>
+        <w:t xml:space="preserve"/>
       </w:r>
       <w:r>
         <w:rPr>
           <w:sz w:val="21"/>
           <w:szCs w:val="21"/>
         </w:rPr>
-        <w:t>parties</w:t>
+        <w:t/>
       </w:r>
       <w:r>
         <w:rPr>
           <w:sz w:val="21"/>
           <w:szCs w:val="21"/>
         </w:rPr>
-        <w:t xml:space="preserve"> </w:t>
+        <w:t xml:space="preserve"/>
       </w:r>
       <w:r>
         <w:rPr>
           <w:sz w:val="21"/>
           <w:szCs w:val="21"/>
         </w:rPr>
-        <w:t>after the date hereof.</w:t>
+        <w:t/>
       </w:r>
       <w:r>
         <w:rPr>
@@ -2946,7 +2946,7 @@
       <w:rPr>
         <w:sz w:val="16"/>
       </w:rPr>
-      <w:t xml:space="preserve"> 2500 Regency Parkway, Cary, NC 27518 </w:t>
+      <w:t xml:space="preserve"> 600 Park Offices Dr, suite#LL-52 Durham, NC 27709 </w:t>
     </w:r>
     <w:r>
       <w:rPr>
@@ -3209,7 +3209,7 @@
       <w:rPr>
         <w:sz w:val="16"/>
       </w:rPr>
-      <w:t xml:space="preserve"> 2500 Regency Parkway, Cary, NC 27518 </w:t>
+      <w:t xml:space="preserve"> 600 Park Offices Dr, suite#LL-52 Durham, NC 27709 </w:t>
     </w:r>
     <w:r>
       <w:rPr>
@@ -3472,7 +3472,7 @@
       <w:rPr>
         <w:sz w:val="16"/>
       </w:rPr>
-      <w:t xml:space="preserve"> 2500 Regency Parkway, Cary, NC 27518 </w:t>
+      <w:t xml:space="preserve"> 600 Park Offices Dr, suite#LL-52 Durham, NC 27709 </w:t>
     </w:r>
     <w:r>
       <w:rPr>

</xml_diff>